<commit_message>
Ajusta logo en segundo llamado por abandono
</commit_message>
<xml_diff>
--- a/app/templates/rrll/abandono/segundo_llamado_abandono.docx
+++ b/app/templates/rrll/abandono/segundo_llamado_abandono.docx
@@ -645,18 +645,18 @@
         <w:noProof/>
       </w:rPr>
       <w:drawing>
-        <wp:anchor distT="0" distB="0" distL="114300" distR="114300" simplePos="0" relativeHeight="251662336" behindDoc="1" locked="0" layoutInCell="1" allowOverlap="1" wp14:anchorId="492175C9" wp14:editId="740A7846">
+        <wp:anchor distT="0" distB="0" distL="114300" distR="114300" simplePos="0" relativeHeight="251661312" behindDoc="1" locked="0" layoutInCell="1" allowOverlap="1" wp14:anchorId="224873BD" wp14:editId="4F88A0DF">
           <wp:simplePos x="0" y="0"/>
           <wp:positionH relativeFrom="column">
-            <wp:posOffset>4820828</wp:posOffset>
+            <wp:posOffset>-590550</wp:posOffset>
           </wp:positionH>
           <wp:positionV relativeFrom="paragraph">
-            <wp:posOffset>-56399</wp:posOffset>
+            <wp:posOffset>-119380</wp:posOffset>
           </wp:positionV>
-          <wp:extent cx="1789962" cy="656349"/>
-          <wp:effectExtent l="0" t="0" r="1270" b="0"/>
+          <wp:extent cx="1836146" cy="698886"/>
+          <wp:effectExtent l="0" t="0" r="0" b="6350"/>
           <wp:wrapNone/>
-          <wp:docPr id="9" name="Imagen 1"/>
+          <wp:docPr id="8" name="Imagen 8"/>
           <wp:cNvGraphicFramePr>
             <a:graphicFrameLocks xmlns:a="http://schemas.openxmlformats.org/drawingml/2006/main" noChangeAspect="1"/>
           </wp:cNvGraphicFramePr>
@@ -664,7 +664,7 @@
             <a:graphicData uri="http://schemas.openxmlformats.org/drawingml/2006/picture">
               <pic:pic xmlns:pic="http://schemas.openxmlformats.org/drawingml/2006/picture">
                 <pic:nvPicPr>
-                  <pic:cNvPr id="1274769010" name="Imagen 1274769010"/>
+                  <pic:cNvPr id="8" name="Imagen 8"/>
                   <pic:cNvPicPr/>
                 </pic:nvPicPr>
                 <pic:blipFill>
@@ -675,262 +675,10 @@
                       </a:ext>
                     </a:extLst>
                   </a:blip>
+                  <a:srcRect t="16167" b="16167"/>
                   <a:stretch>
                     <a:fillRect/>
                   </a:stretch>
-                </pic:blipFill>
-                <pic:spPr>
-                  <a:xfrm>
-                    <a:off x="0" y="0"/>
-                    <a:ext cx="1789962" cy="656349"/>
-                  </a:xfrm>
-                  <a:prstGeom prst="rect">
-                    <a:avLst/>
-                  </a:prstGeom>
-                </pic:spPr>
-              </pic:pic>
-            </a:graphicData>
-          </a:graphic>
-          <wp14:sizeRelH relativeFrom="margin">
-            <wp14:pctWidth>0</wp14:pctWidth>
-          </wp14:sizeRelH>
-          <wp14:sizeRelV relativeFrom="margin">
-            <wp14:pctHeight>0</wp14:pctHeight>
-          </wp14:sizeRelV>
-        </wp:anchor>
-      </w:drawing>
-    </w:r>
-    <w:r>
-      <w:rPr>
-        <w:noProof/>
-      </w:rPr>
-      <w:drawing>
-        <wp:anchor distT="0" distB="0" distL="114300" distR="114300" simplePos="0" relativeHeight="251665408" behindDoc="1" locked="0" layoutInCell="1" allowOverlap="1" wp14:anchorId="7DAF85A0" wp14:editId="5787632B">
-          <wp:simplePos x="0" y="0"/>
-          <wp:positionH relativeFrom="rightMargin">
-            <wp:posOffset>-3795516</wp:posOffset>
-          </wp:positionH>
-          <wp:positionV relativeFrom="paragraph">
-            <wp:posOffset>144889</wp:posOffset>
-          </wp:positionV>
-          <wp:extent cx="488885" cy="274881"/>
-          <wp:effectExtent l="0" t="0" r="6985" b="0"/>
-          <wp:wrapNone/>
-          <wp:docPr id="6" name="Imagen 6"/>
-          <wp:cNvGraphicFramePr>
-            <a:graphicFrameLocks xmlns:a="http://schemas.openxmlformats.org/drawingml/2006/main" noChangeAspect="1"/>
-          </wp:cNvGraphicFramePr>
-          <a:graphic xmlns:a="http://schemas.openxmlformats.org/drawingml/2006/main">
-            <a:graphicData uri="http://schemas.openxmlformats.org/drawingml/2006/picture">
-              <pic:pic xmlns:pic="http://schemas.openxmlformats.org/drawingml/2006/picture">
-                <pic:nvPicPr>
-                  <pic:cNvPr id="0" name="Picture 1"/>
-                  <pic:cNvPicPr>
-                    <a:picLocks noChangeAspect="1" noChangeArrowheads="1"/>
-                  </pic:cNvPicPr>
-                </pic:nvPicPr>
-                <pic:blipFill>
-                  <a:blip r:embed="rId2">
-                    <a:extLst>
-                      <a:ext uri="{28A0092B-C50C-407E-A947-70E740481C1C}">
-                        <a14:useLocalDpi xmlns:a14="http://schemas.microsoft.com/office/drawing/2010/main" val="0"/>
-                      </a:ext>
-                    </a:extLst>
-                  </a:blip>
-                  <a:srcRect/>
-                  <a:stretch>
-                    <a:fillRect/>
-                  </a:stretch>
-                </pic:blipFill>
-                <pic:spPr bwMode="auto">
-                  <a:xfrm>
-                    <a:off x="0" y="0"/>
-                    <a:ext cx="488885" cy="274881"/>
-                  </a:xfrm>
-                  <a:prstGeom prst="rect">
-                    <a:avLst/>
-                  </a:prstGeom>
-                  <a:noFill/>
-                  <a:ln>
-                    <a:noFill/>
-                  </a:ln>
-                </pic:spPr>
-              </pic:pic>
-            </a:graphicData>
-          </a:graphic>
-          <wp14:sizeRelH relativeFrom="margin">
-            <wp14:pctWidth>0</wp14:pctWidth>
-          </wp14:sizeRelH>
-          <wp14:sizeRelV relativeFrom="margin">
-            <wp14:pctHeight>0</wp14:pctHeight>
-          </wp14:sizeRelV>
-        </wp:anchor>
-      </w:drawing>
-    </w:r>
-    <w:r>
-      <w:rPr>
-        <w:noProof/>
-      </w:rPr>
-      <w:drawing>
-        <wp:anchor distT="0" distB="0" distL="114300" distR="114300" simplePos="0" relativeHeight="251664384" behindDoc="1" locked="0" layoutInCell="1" allowOverlap="1" wp14:anchorId="4E7969CB" wp14:editId="531AF4E3">
-          <wp:simplePos x="0" y="0"/>
-          <wp:positionH relativeFrom="column">
-            <wp:posOffset>1673568</wp:posOffset>
-          </wp:positionH>
-          <wp:positionV relativeFrom="paragraph">
-            <wp:posOffset>85518</wp:posOffset>
-          </wp:positionV>
-          <wp:extent cx="403907" cy="403907"/>
-          <wp:effectExtent l="0" t="0" r="0" b="0"/>
-          <wp:wrapNone/>
-          <wp:docPr id="5" name="Imagen 5"/>
-          <wp:cNvGraphicFramePr>
-            <a:graphicFrameLocks xmlns:a="http://schemas.openxmlformats.org/drawingml/2006/main" noChangeAspect="1"/>
-          </wp:cNvGraphicFramePr>
-          <a:graphic xmlns:a="http://schemas.openxmlformats.org/drawingml/2006/main">
-            <a:graphicData uri="http://schemas.openxmlformats.org/drawingml/2006/picture">
-              <pic:pic xmlns:pic="http://schemas.openxmlformats.org/drawingml/2006/picture">
-                <pic:nvPicPr>
-                  <pic:cNvPr id="1516878429" name="Imagen 1516878429"/>
-                  <pic:cNvPicPr/>
-                </pic:nvPicPr>
-                <pic:blipFill>
-                  <a:blip r:embed="rId3">
-                    <a:extLst>
-                      <a:ext uri="{28A0092B-C50C-407E-A947-70E740481C1C}">
-                        <a14:useLocalDpi xmlns:a14="http://schemas.microsoft.com/office/drawing/2010/main" val="0"/>
-                      </a:ext>
-                    </a:extLst>
-                  </a:blip>
-                  <a:stretch>
-                    <a:fillRect/>
-                  </a:stretch>
-                </pic:blipFill>
-                <pic:spPr>
-                  <a:xfrm>
-                    <a:off x="0" y="0"/>
-                    <a:ext cx="403907" cy="403907"/>
-                  </a:xfrm>
-                  <a:prstGeom prst="rect">
-                    <a:avLst/>
-                  </a:prstGeom>
-                </pic:spPr>
-              </pic:pic>
-            </a:graphicData>
-          </a:graphic>
-          <wp14:sizeRelH relativeFrom="margin">
-            <wp14:pctWidth>0</wp14:pctWidth>
-          </wp14:sizeRelH>
-          <wp14:sizeRelV relativeFrom="margin">
-            <wp14:pctHeight>0</wp14:pctHeight>
-          </wp14:sizeRelV>
-        </wp:anchor>
-      </w:drawing>
-    </w:r>
-    <w:r>
-      <w:rPr>
-        <w:noProof/>
-      </w:rPr>
-      <w:drawing>
-        <wp:anchor distT="0" distB="0" distL="114300" distR="114300" simplePos="0" relativeHeight="251663360" behindDoc="1" locked="0" layoutInCell="1" allowOverlap="1" wp14:anchorId="730F2DFC" wp14:editId="66ABF447">
-          <wp:simplePos x="0" y="0"/>
-          <wp:positionH relativeFrom="column">
-            <wp:posOffset>1129490</wp:posOffset>
-          </wp:positionH>
-          <wp:positionV relativeFrom="paragraph">
-            <wp:posOffset>396</wp:posOffset>
-          </wp:positionV>
-          <wp:extent cx="434093" cy="656348"/>
-          <wp:effectExtent l="0" t="0" r="4445" b="0"/>
-          <wp:wrapNone/>
-          <wp:docPr id="7" name="Imagen 7"/>
-          <wp:cNvGraphicFramePr>
-            <a:graphicFrameLocks xmlns:a="http://schemas.openxmlformats.org/drawingml/2006/main" noChangeAspect="1"/>
-          </wp:cNvGraphicFramePr>
-          <a:graphic xmlns:a="http://schemas.openxmlformats.org/drawingml/2006/main">
-            <a:graphicData uri="http://schemas.openxmlformats.org/drawingml/2006/picture">
-              <pic:pic xmlns:pic="http://schemas.openxmlformats.org/drawingml/2006/picture">
-                <pic:nvPicPr>
-                  <pic:cNvPr id="813757126" name="Imagen 813757126"/>
-                  <pic:cNvPicPr/>
-                </pic:nvPicPr>
-                <pic:blipFill rotWithShape="1">
-                  <a:blip r:embed="rId4">
-                    <a:extLst>
-                      <a:ext uri="{28A0092B-C50C-407E-A947-70E740481C1C}">
-                        <a14:useLocalDpi xmlns:a14="http://schemas.microsoft.com/office/drawing/2010/main" val="0"/>
-                      </a:ext>
-                    </a:extLst>
-                  </a:blip>
-                  <a:srcRect r="45172"/>
-                  <a:stretch/>
-                </pic:blipFill>
-                <pic:spPr bwMode="auto">
-                  <a:xfrm>
-                    <a:off x="0" y="0"/>
-                    <a:ext cx="434093" cy="656348"/>
-                  </a:xfrm>
-                  <a:prstGeom prst="rect">
-                    <a:avLst/>
-                  </a:prstGeom>
-                  <a:ln>
-                    <a:noFill/>
-                  </a:ln>
-                  <a:extLst>
-                    <a:ext uri="{53640926-AAD7-44D8-BBD7-CCE9431645EC}">
-                      <a14:shadowObscured xmlns:a14="http://schemas.microsoft.com/office/drawing/2010/main"/>
-                    </a:ext>
-                  </a:extLst>
-                </pic:spPr>
-              </pic:pic>
-            </a:graphicData>
-          </a:graphic>
-          <wp14:sizeRelH relativeFrom="margin">
-            <wp14:pctWidth>0</wp14:pctWidth>
-          </wp14:sizeRelH>
-          <wp14:sizeRelV relativeFrom="margin">
-            <wp14:pctHeight>0</wp14:pctHeight>
-          </wp14:sizeRelV>
-        </wp:anchor>
-      </w:drawing>
-    </w:r>
-    <w:r>
-      <w:rPr>
-        <w:noProof/>
-      </w:rPr>
-      <w:drawing>
-        <wp:anchor distT="0" distB="0" distL="114300" distR="114300" simplePos="0" relativeHeight="251661312" behindDoc="1" locked="0" layoutInCell="1" allowOverlap="1" wp14:anchorId="224873BD" wp14:editId="3C6464DC">
-          <wp:simplePos x="0" y="0"/>
-          <wp:positionH relativeFrom="column">
-            <wp:posOffset>-592303</wp:posOffset>
-          </wp:positionH>
-          <wp:positionV relativeFrom="paragraph">
-            <wp:posOffset>-118600</wp:posOffset>
-          </wp:positionV>
-          <wp:extent cx="1812821" cy="690008"/>
-          <wp:effectExtent l="0" t="0" r="0" b="0"/>
-          <wp:wrapNone/>
-          <wp:docPr id="8" name="Imagen 8"/>
-          <wp:cNvGraphicFramePr>
-            <a:graphicFrameLocks xmlns:a="http://schemas.openxmlformats.org/drawingml/2006/main" noChangeAspect="1"/>
-          </wp:cNvGraphicFramePr>
-          <a:graphic xmlns:a="http://schemas.openxmlformats.org/drawingml/2006/main">
-            <a:graphicData uri="http://schemas.openxmlformats.org/drawingml/2006/picture">
-              <pic:pic xmlns:pic="http://schemas.openxmlformats.org/drawingml/2006/picture">
-                <pic:nvPicPr>
-                  <pic:cNvPr id="1" name=""/>
-                  <pic:cNvPicPr/>
-                </pic:nvPicPr>
-                <pic:blipFill rotWithShape="1">
-                  <a:blip r:embed="rId5">
-                    <a:extLst>
-                      <a:ext uri="{28A0092B-C50C-407E-A947-70E740481C1C}">
-                        <a14:useLocalDpi xmlns:a14="http://schemas.microsoft.com/office/drawing/2010/main" val="0"/>
-                      </a:ext>
-                    </a:extLst>
-                  </a:blip>
-                  <a:srcRect l="7800" t="10816" b="16189"/>
-                  <a:stretch/>
                 </pic:blipFill>
                 <pic:spPr bwMode="auto">
                   <a:xfrm>
@@ -1117,6 +865,9 @@
   </wne:recipientData>
   <wne:recipientData>
     <wne:active wne:val="0"/>
+  </wne:recipientData>
+  <wne:recipientData>
+    <wne:active wne:val="1"/>
   </wne:recipientData>
   <wne:recipientData>
     <wne:active wne:val="1"/>

</xml_diff>